<commit_message>
fix: 07 uses the official items table; event status follows only its proposal
- Fund withdrawal items are unit price × quantity in the template's own table, with its payment
  methods (QIU to vendor / Student self purchase); payees must add up to the total; template
  sample highlighting is not carried into filled values
- Approval engine no longer changes an approved event's status when another document about the
  event (attendance list, fund withdrawal) is submitted or returned — it hid approved events

Co-Authored-By: Claude Opus 5.5 <noreply@anthropic.com>
</commit_message>
<xml_diff>
--- a/resources/templates/filled/07. Student Organization Fund Withdrawal and Transfer Form template.docx
+++ b/resources/templates/filled/07. Student Organization Fund Withdrawal and Transfer Form template.docx
@@ -450,35 +450,6 @@
         <w:rPr>
           <w:rtl w:val="0"/>
         </w:rPr>
-        <w:t xml:space="preserve">${items}</w:t>
-      </w:r>
-    </w:p>
-    <w:p>
-      <w:pPr>
-        <w:spacing w:after="0" w:line="240" w:lineRule="auto"/>
-        <w:rPr>
-          <w:rFonts w:ascii="Arial" w:cs="Arial" w:eastAsia="Arial" w:hAnsi="Arial"/>
-        </w:rPr>
-      </w:pPr>
-      <w:r>
-        <w:rPr>
-          <w:rtl w:val="0"/>
-        </w:rPr>
-        <w:t xml:space="preserve">${item_no}. ${item_description} – RM${item_amount} (${item_method})</w:t>
-      </w:r>
-    </w:p>
-    <w:p>
-      <w:pPr>
-        <w:spacing w:after="0" w:line="240" w:lineRule="auto"/>
-        <w:rPr>
-          <w:rFonts w:ascii="Arial" w:cs="Arial" w:eastAsia="Arial" w:hAnsi="Arial"/>
-        </w:rPr>
-      </w:pPr>
-      <w:r>
-        <w:rPr>
-          <w:rtl w:val="0"/>
-        </w:rPr>
-        <w:t xml:space="preserve">${/items}</w:t>
       </w:r>
     </w:p>
     <w:sdt>
@@ -1093,7 +1064,7 @@
                     <w:rFonts w:ascii="Arial" w:cs="Arial" w:eastAsia="Arial" w:hAnsi="Arial"/>
                     <w:rtl w:val="0"/>
                   </w:rPr>
-                  <w:t xml:space="preserve">1</w:t>
+                  <w:t xml:space="preserve">${item_no}</w:t>
                 </w:r>
               </w:p>
             </w:tc>
@@ -1133,10 +1104,9 @@
                 <w:r>
                   <w:rPr>
                     <w:rFonts w:ascii="Arial" w:cs="Arial" w:eastAsia="Arial" w:hAnsi="Arial"/>
-                    <w:highlight w:val="yellow"/>
                     <w:rtl w:val="0"/>
                   </w:rPr>
-                  <w:t xml:space="preserve">Bread</w:t>
+                  <w:t xml:space="preserve">${item_description}</w:t>
                 </w:r>
               </w:p>
             </w:tc>
@@ -1176,10 +1146,9 @@
                 <w:r>
                   <w:rPr>
                     <w:rFonts w:ascii="Arial" w:cs="Arial" w:eastAsia="Arial" w:hAnsi="Arial"/>
-                    <w:highlight w:val="yellow"/>
                     <w:rtl w:val="0"/>
                   </w:rPr>
-                  <w:t xml:space="preserve">2.00</w:t>
+                  <w:t xml:space="preserve">${item_price}</w:t>
                 </w:r>
               </w:p>
             </w:tc>
@@ -1219,10 +1188,9 @@
                 <w:r>
                   <w:rPr>
                     <w:rFonts w:ascii="Arial" w:cs="Arial" w:eastAsia="Arial" w:hAnsi="Arial"/>
-                    <w:highlight w:val="yellow"/>
                     <w:rtl w:val="0"/>
                   </w:rPr>
-                  <w:t xml:space="preserve">25</w:t>
+                  <w:t xml:space="preserve">${item_quantity}</w:t>
                 </w:r>
               </w:p>
             </w:tc>
@@ -1262,10 +1230,9 @@
                 <w:r>
                   <w:rPr>
                     <w:rFonts w:ascii="Arial" w:cs="Arial" w:eastAsia="Arial" w:hAnsi="Arial"/>
-                    <w:highlight w:val="yellow"/>
                     <w:rtl w:val="0"/>
                   </w:rPr>
-                  <w:t xml:space="preserve">50.00</w:t>
+                  <w:t xml:space="preserve">${item_total}</w:t>
                 </w:r>
               </w:p>
             </w:tc>
@@ -1305,10 +1272,9 @@
                 <w:r>
                   <w:rPr>
                     <w:rFonts w:ascii="Arial" w:cs="Arial" w:eastAsia="Arial" w:hAnsi="Arial"/>
-                    <w:highlight w:val="yellow"/>
                     <w:rtl w:val="0"/>
                   </w:rPr>
-                  <w:t xml:space="preserve">QIU to vendor</w:t>
+                  <w:t xml:space="preserve">${item_method}</w:t>
                 </w:r>
               </w:p>
             </w:tc>
@@ -1352,268 +1318,6 @@
                 </w:pPr>
                 <w:r>
                   <w:rPr>
-                    <w:rFonts w:ascii="Arial" w:cs="Arial" w:eastAsia="Arial" w:hAnsi="Arial"/>
-                    <w:rtl w:val="0"/>
-                  </w:rPr>
-                  <w:t xml:space="preserve">2</w:t>
-                </w:r>
-              </w:p>
-            </w:tc>
-            <w:tc>
-              <w:tcPr>
-                <w:shd w:fill="auto" w:val="clear"/>
-                <w:tcMar>
-                  <w:top w:w="100.0" w:type="dxa"/>
-                  <w:left w:w="100.0" w:type="dxa"/>
-                  <w:bottom w:w="100.0" w:type="dxa"/>
-                  <w:right w:w="100.0" w:type="dxa"/>
-                </w:tcMar>
-                <w:vAlign w:val="top"/>
-              </w:tcPr>
-              <w:p>
-                <w:pPr>
-                  <w:keepNext w:val="0"/>
-                  <w:keepLines w:val="0"/>
-                  <w:pageBreakBefore w:val="0"/>
-                  <w:widowControl w:val="0"/>
-                  <w:pBdr>
-                    <w:top w:space="0" w:sz="0" w:val="nil"/>
-                    <w:left w:space="0" w:sz="0" w:val="nil"/>
-                    <w:bottom w:space="0" w:sz="0" w:val="nil"/>
-                    <w:right w:space="0" w:sz="0" w:val="nil"/>
-                    <w:between w:space="0" w:sz="0" w:val="nil"/>
-                  </w:pBdr>
-                  <w:shd w:fill="auto" w:val="clear"/>
-                  <w:spacing w:after="0" w:before="0" w:line="240" w:lineRule="auto"/>
-                  <w:ind w:left="0" w:right="0" w:firstLine="0"/>
-                  <w:jc w:val="left"/>
-                  <w:rPr>
-                    <w:rFonts w:ascii="Arial" w:cs="Arial" w:eastAsia="Arial" w:hAnsi="Arial"/>
-                    <w:highlight w:val="yellow"/>
-                  </w:rPr>
-                </w:pPr>
-                <w:r>
-                  <w:rPr>
-                    <w:rFonts w:ascii="Arial" w:cs="Arial" w:eastAsia="Arial" w:hAnsi="Arial"/>
-                    <w:highlight w:val="yellow"/>
-                    <w:rtl w:val="0"/>
-                  </w:rPr>
-                  <w:t xml:space="preserve">100 Plus Drinks</w:t>
-                </w:r>
-              </w:p>
-            </w:tc>
-            <w:tc>
-              <w:tcPr>
-                <w:shd w:fill="auto" w:val="clear"/>
-                <w:tcMar>
-                  <w:top w:w="100.0" w:type="dxa"/>
-                  <w:left w:w="100.0" w:type="dxa"/>
-                  <w:bottom w:w="100.0" w:type="dxa"/>
-                  <w:right w:w="100.0" w:type="dxa"/>
-                </w:tcMar>
-                <w:vAlign w:val="top"/>
-              </w:tcPr>
-              <w:p>
-                <w:pPr>
-                  <w:keepNext w:val="0"/>
-                  <w:keepLines w:val="0"/>
-                  <w:pageBreakBefore w:val="0"/>
-                  <w:widowControl w:val="0"/>
-                  <w:pBdr>
-                    <w:top w:space="0" w:sz="0" w:val="nil"/>
-                    <w:left w:space="0" w:sz="0" w:val="nil"/>
-                    <w:bottom w:space="0" w:sz="0" w:val="nil"/>
-                    <w:right w:space="0" w:sz="0" w:val="nil"/>
-                    <w:between w:space="0" w:sz="0" w:val="nil"/>
-                  </w:pBdr>
-                  <w:shd w:fill="auto" w:val="clear"/>
-                  <w:spacing w:after="0" w:before="0" w:line="240" w:lineRule="auto"/>
-                  <w:ind w:left="0" w:right="0" w:firstLine="0"/>
-                  <w:jc w:val="left"/>
-                  <w:rPr>
-                    <w:rFonts w:ascii="Arial" w:cs="Arial" w:eastAsia="Arial" w:hAnsi="Arial"/>
-                    <w:highlight w:val="yellow"/>
-                  </w:rPr>
-                </w:pPr>
-                <w:r>
-                  <w:rPr>
-                    <w:rFonts w:ascii="Arial" w:cs="Arial" w:eastAsia="Arial" w:hAnsi="Arial"/>
-                    <w:highlight w:val="yellow"/>
-                    <w:rtl w:val="0"/>
-                  </w:rPr>
-                  <w:t xml:space="preserve">3.00</w:t>
-                </w:r>
-              </w:p>
-            </w:tc>
-            <w:tc>
-              <w:tcPr>
-                <w:shd w:fill="auto" w:val="clear"/>
-                <w:tcMar>
-                  <w:top w:w="100.0" w:type="dxa"/>
-                  <w:left w:w="100.0" w:type="dxa"/>
-                  <w:bottom w:w="100.0" w:type="dxa"/>
-                  <w:right w:w="100.0" w:type="dxa"/>
-                </w:tcMar>
-                <w:vAlign w:val="top"/>
-              </w:tcPr>
-              <w:p>
-                <w:pPr>
-                  <w:keepNext w:val="0"/>
-                  <w:keepLines w:val="0"/>
-                  <w:pageBreakBefore w:val="0"/>
-                  <w:widowControl w:val="0"/>
-                  <w:pBdr>
-                    <w:top w:space="0" w:sz="0" w:val="nil"/>
-                    <w:left w:space="0" w:sz="0" w:val="nil"/>
-                    <w:bottom w:space="0" w:sz="0" w:val="nil"/>
-                    <w:right w:space="0" w:sz="0" w:val="nil"/>
-                    <w:between w:space="0" w:sz="0" w:val="nil"/>
-                  </w:pBdr>
-                  <w:shd w:fill="auto" w:val="clear"/>
-                  <w:spacing w:after="0" w:before="0" w:line="240" w:lineRule="auto"/>
-                  <w:ind w:left="0" w:right="0" w:firstLine="0"/>
-                  <w:jc w:val="left"/>
-                  <w:rPr>
-                    <w:rFonts w:ascii="Arial" w:cs="Arial" w:eastAsia="Arial" w:hAnsi="Arial"/>
-                    <w:highlight w:val="yellow"/>
-                  </w:rPr>
-                </w:pPr>
-                <w:r>
-                  <w:rPr>
-                    <w:rFonts w:ascii="Arial" w:cs="Arial" w:eastAsia="Arial" w:hAnsi="Arial"/>
-                    <w:highlight w:val="yellow"/>
-                    <w:rtl w:val="0"/>
-                  </w:rPr>
-                  <w:t xml:space="preserve">25</w:t>
-                </w:r>
-              </w:p>
-            </w:tc>
-            <w:tc>
-              <w:tcPr>
-                <w:shd w:fill="auto" w:val="clear"/>
-                <w:tcMar>
-                  <w:top w:w="100.0" w:type="dxa"/>
-                  <w:left w:w="100.0" w:type="dxa"/>
-                  <w:bottom w:w="100.0" w:type="dxa"/>
-                  <w:right w:w="100.0" w:type="dxa"/>
-                </w:tcMar>
-                <w:vAlign w:val="top"/>
-              </w:tcPr>
-              <w:p>
-                <w:pPr>
-                  <w:keepNext w:val="0"/>
-                  <w:keepLines w:val="0"/>
-                  <w:pageBreakBefore w:val="0"/>
-                  <w:widowControl w:val="0"/>
-                  <w:pBdr>
-                    <w:top w:space="0" w:sz="0" w:val="nil"/>
-                    <w:left w:space="0" w:sz="0" w:val="nil"/>
-                    <w:bottom w:space="0" w:sz="0" w:val="nil"/>
-                    <w:right w:space="0" w:sz="0" w:val="nil"/>
-                    <w:between w:space="0" w:sz="0" w:val="nil"/>
-                  </w:pBdr>
-                  <w:shd w:fill="auto" w:val="clear"/>
-                  <w:spacing w:after="0" w:before="0" w:line="240" w:lineRule="auto"/>
-                  <w:ind w:left="0" w:right="0" w:firstLine="0"/>
-                  <w:jc w:val="left"/>
-                  <w:rPr>
-                    <w:rFonts w:ascii="Arial" w:cs="Arial" w:eastAsia="Arial" w:hAnsi="Arial"/>
-                    <w:highlight w:val="yellow"/>
-                  </w:rPr>
-                </w:pPr>
-                <w:r>
-                  <w:rPr>
-                    <w:rFonts w:ascii="Arial" w:cs="Arial" w:eastAsia="Arial" w:hAnsi="Arial"/>
-                    <w:highlight w:val="yellow"/>
-                    <w:rtl w:val="0"/>
-                  </w:rPr>
-                  <w:t xml:space="preserve">75.00</w:t>
-                </w:r>
-              </w:p>
-            </w:tc>
-            <w:tc>
-              <w:tcPr>
-                <w:shd w:fill="auto" w:val="clear"/>
-                <w:tcMar>
-                  <w:top w:w="100.0" w:type="dxa"/>
-                  <w:left w:w="100.0" w:type="dxa"/>
-                  <w:bottom w:w="100.0" w:type="dxa"/>
-                  <w:right w:w="100.0" w:type="dxa"/>
-                </w:tcMar>
-                <w:vAlign w:val="top"/>
-              </w:tcPr>
-              <w:p>
-                <w:pPr>
-                  <w:keepNext w:val="0"/>
-                  <w:keepLines w:val="0"/>
-                  <w:pageBreakBefore w:val="0"/>
-                  <w:widowControl w:val="0"/>
-                  <w:pBdr>
-                    <w:top w:space="0" w:sz="0" w:val="nil"/>
-                    <w:left w:space="0" w:sz="0" w:val="nil"/>
-                    <w:bottom w:space="0" w:sz="0" w:val="nil"/>
-                    <w:right w:space="0" w:sz="0" w:val="nil"/>
-                    <w:between w:space="0" w:sz="0" w:val="nil"/>
-                  </w:pBdr>
-                  <w:shd w:fill="auto" w:val="clear"/>
-                  <w:spacing w:after="0" w:before="0" w:line="240" w:lineRule="auto"/>
-                  <w:ind w:left="0" w:right="0" w:firstLine="0"/>
-                  <w:jc w:val="left"/>
-                  <w:rPr>
-                    <w:rFonts w:ascii="Arial" w:cs="Arial" w:eastAsia="Arial" w:hAnsi="Arial"/>
-                    <w:highlight w:val="yellow"/>
-                  </w:rPr>
-                </w:pPr>
-                <w:r>
-                  <w:rPr>
-                    <w:rFonts w:ascii="Arial" w:cs="Arial" w:eastAsia="Arial" w:hAnsi="Arial"/>
-                    <w:highlight w:val="yellow"/>
-                    <w:rtl w:val="0"/>
-                  </w:rPr>
-                  <w:t xml:space="preserve">Student self purchase</w:t>
-                </w:r>
-              </w:p>
-            </w:tc>
-          </w:tr>
-          <w:tr>
-            <w:trPr>
-              <w:cantSplit w:val="0"/>
-              <w:tblHeader w:val="0"/>
-            </w:trPr>
-            <w:tc>
-              <w:tcPr>
-                <w:shd w:fill="auto" w:val="clear"/>
-                <w:tcMar>
-                  <w:top w:w="100.0" w:type="dxa"/>
-                  <w:left w:w="100.0" w:type="dxa"/>
-                  <w:bottom w:w="100.0" w:type="dxa"/>
-                  <w:right w:w="100.0" w:type="dxa"/>
-                </w:tcMar>
-                <w:vAlign w:val="top"/>
-              </w:tcPr>
-              <w:p>
-                <w:pPr>
-                  <w:keepNext w:val="0"/>
-                  <w:keepLines w:val="0"/>
-                  <w:pageBreakBefore w:val="0"/>
-                  <w:widowControl w:val="0"/>
-                  <w:pBdr>
-                    <w:top w:space="0" w:sz="0" w:val="nil"/>
-                    <w:left w:space="0" w:sz="0" w:val="nil"/>
-                    <w:bottom w:space="0" w:sz="0" w:val="nil"/>
-                    <w:right w:space="0" w:sz="0" w:val="nil"/>
-                    <w:between w:space="0" w:sz="0" w:val="nil"/>
-                  </w:pBdr>
-                  <w:shd w:fill="auto" w:val="clear"/>
-                  <w:spacing w:after="0" w:before="0" w:line="240" w:lineRule="auto"/>
-                  <w:ind w:left="0" w:right="0" w:firstLine="0"/>
-                  <w:jc w:val="left"/>
-                  <w:rPr>
-                    <w:rFonts w:ascii="Arial" w:cs="Arial" w:eastAsia="Arial" w:hAnsi="Arial"/>
-                  </w:rPr>
-                </w:pPr>
-                <w:r>
-                  <w:rPr>
                     <w:rtl w:val="0"/>
                   </w:rPr>
                 </w:r>
@@ -1774,10 +1478,9 @@
                 <w:r>
                   <w:rPr>
                     <w:rFonts w:ascii="Arial" w:cs="Arial" w:eastAsia="Arial" w:hAnsi="Arial"/>
-                    <w:highlight w:val="yellow"/>
                     <w:rtl w:val="0"/>
                   </w:rPr>
-                  <w:t xml:space="preserve">125.00</w:t>
+                  <w:t xml:space="preserve">${total}</w:t>
                 </w:r>
               </w:p>
             </w:tc>

</xml_diff>